<commit_message>
scenario: lift the Ledgerline Multi-AZ database restriction
Ledgerline is the practice vehicle for HA database work, and the scenario's
stated Multi-AZ limitation was giving students grounds to decline the practice.

- CL3 AT1 solution design builder: the database is converted to a Multi-AZ
  deployment with an automatic-failover standby, justified on cost-versus-benefit
  against the two-hour RTO, with backup/PITR/cross-Region DR retained behind it
- regenerate the AT1 exemplar; the same builder writes the website's Approved
  Improvement Design, committed in the website repo
- fix the output path (sibling is diploma-cloud-cyber-website-s1) — a regenerate
  would otherwise have created a phantom directory at the umbrella root
- lab-pack baseline.yaml: comments no longer claim Ledgerline cannot do Multi-AZ;
  single-AZ is the starting state, not a limit. improved.yaml deliberately
  untouched — deferred

Co-Authored-By: Claude Opus 5 (1M context) <noreply@anthropic.com>
</commit_message>
<xml_diff>
--- a/S1-CL3-Cloud-Infrastructure-Improvement/assessments/AT1/AT1-exemplar-solution-design.docx
+++ b/S1-CL3-Cloud-Infrastructure-Improvement/assessments/AT1/AT1-exemplar-solution-design.docx
@@ -1115,7 +1115,7 @@
         <w:rPr>
           <w:sz w:val="21"/>
         </w:rPr>
-        <w:t>The database is a single instance with no standby. Ledgerline cannot run on a Multi-AZ (mirrored) database — it is vendor-certified single-instance only (see the Cloud Migration Technical Finding) — so automatic database failover is not available; an AZ or instance failure means an outage and a restore-from-backup. This residual single point of failure is mitigated, not eliminated, by the reliability improvements below.</w:t>
+        <w:t>The database is a single instance with no standby, so an AZ or instance failure means an outage and a restore-from-backup. Ledgerline runs on a managed Multi-AZ database, so this single point of failure can be removed outright by the reliability improvements below.</w:t>
       </w:r>
     </w:p>
     <w:p>
@@ -1331,7 +1331,7 @@
               <w:rPr>
                 <w:sz w:val="18"/>
               </w:rPr>
-              <w:t>Make the application tier Multi-AZ (survive AZ/instance failure automatically); the database cannot be Multi-AZ (Ledgerline constraint), so strengthen backup, point-in-time restore and cross-Region DR instead</w:t>
+              <w:t>Make the application tier Multi-AZ and convert the database to a Multi-AZ deployment with an automatic-failover standby, so both tiers survive an AZ/instance failure automatically; keep backup, point-in-time restore and cross-Region DR behind them</w:t>
             </w:r>
           </w:p>
         </w:tc>
@@ -1714,7 +1714,7 @@
               <w:rPr>
                 <w:sz w:val="18"/>
               </w:rPr>
-              <w:t>App tier survives an AZ/instance failure automatically; database recovers within the business-day RTO from backup (Multi-AZ database not available — Ledgerline constraint)</w:t>
+              <w:t>Application tier and database both survive an AZ/instance failure automatically; backup, point-in-time restore and cross-Region DR cover data loss, corruption and Region-level events</w:t>
             </w:r>
           </w:p>
         </w:tc>
@@ -1733,7 +1733,7 @@
               <w:rPr>
                 <w:sz w:val="18"/>
               </w:rPr>
-              <w:t>App tier: auto-recovery &lt; 15 min on AZ/instance failure. Database: RPO &lt;= 1 hour (frequent log backups); RTO within the agreed business day via point-in-time restore / cross-Region copy</w:t>
+              <w:t>App tier: auto-recovery &lt; 15 min on AZ/instance failure. Database: automatic failover under two minutes; RPO &lt;= 1 hour (frequent log backups); cross-Region restore within the agreed business day</w:t>
             </w:r>
           </w:p>
         </w:tc>
@@ -1933,7 +1933,7 @@
         <w:rPr>
           <w:sz w:val="21"/>
         </w:rPr>
-        <w:t>Reviewed against IR-1 to IR-7, the improvement is: make the application tier Multi-AZ on a two-AZ network (the database stays single-instance — Ledgerline does not support Multi-AZ — with strengthened backup, point-in-time restore and cross-Region DR), harden security, realise the idle-profile and storage cost savings, confirm elastic headroom, and add the light India residency slice for regulatory logs and financial records. The application, its SQL Server stack and its data are preserved (IR-4); every change is proportionate and cost-justified (IR-2, IR-6).</w:t>
+        <w:t>Reviewed against IR-1 to IR-7, the improvement is: make the application tier Multi-AZ on a two-AZ network and convert the database to a Multi-AZ deployment with an automatic-failover standby (with backup, point-in-time restore and cross-Region DR behind it), harden security, realise the idle-profile and storage cost savings, confirm elastic headroom, and add the light India residency slice for regulatory logs and financial records. The application, its SQL Server stack and its data are preserved (IR-4); every change is proportionate and cost-justified (IR-2, IR-6).</w:t>
       </w:r>
     </w:p>
     <w:p>
@@ -2694,7 +2694,7 @@
               <w:rPr>
                 <w:sz w:val="18"/>
               </w:rPr>
-              <w:t>Single instance retained — Ledgerline does not support a Multi-AZ (mirrored) database (see the Cloud Migration Technical Finding), so automatic failover is not an option. Reliability is delivered instead by automated backups with point-in-time recovery, frequent transaction-log backups (RPO &lt;= 1 hour), an automated cross-Region backup copy to a second Australian Region (Melbourne, ap-southeast-4) for disaster recovery — keeping financial data in Australia — and a tested restore runbook that recovers within the business-day RTO</w:t>
+              <w:t>Converted to a Multi-AZ deployment — a synchronously replicated standby in the second Availability Zone with automatic failover under two minutes, removing the database as a single point of failure. The application reaches the database by endpoint name, so failover needs no reconfiguration. Behind it: automated backups with point-in-time recovery, frequent transaction-log backups (RPO &lt;= 1 hour), an automated cross-Region backup copy to a second Australian Region (Melbourne, ap-southeast-4) for disaster recovery — keeping financial data in Australia — and a tested restore runbook</w:t>
             </w:r>
           </w:p>
         </w:tc>
@@ -2788,7 +2788,7 @@
         <w:rPr>
           <w:sz w:val="21"/>
         </w:rPr>
-        <w:t>Reliability decision — cost versus benefit (IR-2, IR-6). The only way to give the database automatic high availability would be to replace Ledgerline with an accounting product that supports a Multi-AZ database — a new software licence, a full data-migration project, staff retraining and change management, and the associated delivery and business risk. Weighed against the actual need — an internal, business-hours finance system with outsourced payroll, an estimated $400/hour business-hours cost of downtime, and an accepted business-day RTO — that programme is disproportionate and is not recommended. The proportionate choice is to keep Ledgerline on a single-instance database and meet reliability through robust automated backups, point-in-time restore and cross-Region DR, accepting a short, bounded restore-time gap on the rare AZ/instance failure. The application tier is made Multi-AZ regardless, because that is low-cost and fully supported.</w:t>
+        <w:t>Reliability decision — cost versus benefit (IR-2, IR-6). Converting the database to Multi-AZ roughly doubles its instance and storage cost, because a standby of the same class runs alongside the primary. Weighed against the actual need — an internal, business-hours finance system with outsourced payroll, an estimated $400/hour business-hours cost of downtime, and a two-hour recovery-time objective that a restore-only recovery does not reliably meet — the standby is proportionate and is recommended: it takes database recovery from hours to under two minutes, with no application change and no manual intervention. Backup, point-in-time restore and the cross-Region DR copy are retained behind it, because failover addresses AZ and instance failure but not data loss, corruption or a Region-level event. The application tier is made Multi-AZ on the same reasoning, at lower cost again.</w:t>
       </w:r>
     </w:p>
     <w:p>
@@ -3113,7 +3113,7 @@
         <w:rPr>
           <w:sz w:val="21"/>
         </w:rPr>
-        <w:t>Each goal in §3.3 is met by the design above: reliability by a Multi-AZ application tier on a two-AZ network (auto-failover) plus strengthened database backup, point-in-time restore and cross-Region DR (the database cannot be Multi-AZ — Ledgerline constraint); scalability by the retained ASG target-tracking plus elastic storage and endpoint headroom (demonstrable on demand, not over-provisioned); cost by the business-hours schedule, storage tiering, right-sizing and the licensing review; security by the hardening, encryption and least-privilege posture; compliance by the India residency slice.</w:t>
+        <w:t>Each goal in §3.3 is met by the design above: reliability by a Multi-AZ application tier and a Multi-AZ database with an automatic-failover standby on a two-AZ network, backed by database backup, point-in-time restore and cross-Region DR; scalability by the retained ASG target-tracking plus elastic storage and endpoint headroom (demonstrable on demand, not over-provisioned); cost by the business-hours schedule, storage tiering, right-sizing and the licensing review; security by the hardening, encryption and least-privilege posture; compliance by the India residency slice.</w:t>
       </w:r>
     </w:p>
     <w:p>
@@ -3129,7 +3129,7 @@
         <w:rPr>
           <w:sz w:val="21"/>
         </w:rPr>
-        <w:t>The single-AZ compute SPOF (§3.1) is removed: the application tier runs across two AZs behind the internal ALB on a network that now spans both AZs. The database remains a single instance — Ledgerline does not support Multi-AZ — so its outage risk is not eliminated but is mitigated to a short, bounded restore-time gap by automated backups, point-in-time restore and a cross-Region DR copy; accepting that residual risk is the proportionate, cost-justified decision (§4.6).</w:t>
+        <w:t>Both single points of failure identified in §3.1 are removed. The application tier runs across two AZs behind the internal ALB on a network that now spans both AZs. The database runs as a Multi-AZ deployment with a synchronous standby in the second AZ and automatic failover, so an AZ or instance failure no longer takes the system down. Automated backups, point-in-time restore and the cross-Region DR copy remain in place to cover what failover does not: data loss, corruption and Region-level events (§4.6).</w:t>
       </w:r>
     </w:p>
     <w:p>
@@ -3506,7 +3506,7 @@
         <w:rPr>
           <w:sz w:val="21"/>
         </w:rPr>
-        <w:t>Reliability — terminate an app instance and confirm the ASG replaces it across AZs with no outage (application-tier auto-recovery); for the database, perform a point-in-time restore and a cross-Region (Melbourne) DR restore and confirm recovery within the business-day RTO with RPO &lt;= 1 hour and no data loss. The database is single-instance — no Multi-AZ failover to test — per the Ledgerline constraint.</w:t>
+        <w:t>Reliability — terminate an app instance and confirm the ASG replaces it across AZs with no outage (application-tier auto-recovery); force a database failover and confirm the standby is promoted automatically, the application reconnects by endpoint name without reconfiguration, and service resumes inside two minutes; and perform a point-in-time restore and a cross-Region (Melbourne) DR restore, confirming recovery with RPO &lt;= 1 hour and no data loss.</w:t>
       </w:r>
     </w:p>
     <w:p>
@@ -4123,7 +4123,7 @@
         <w:rPr>
           <w:sz w:val="21"/>
         </w:rPr>
-        <w:t>The baseline's single points of failure are the single-AZ application tier and the single-instance database. The design removes the application-tier SPOF by spanning the network across two AZs and running the application Auto Scaling group across both AZs behind the internal load balancer. The database, however, cannot be made Multi-AZ — Ledgerline is vendor-certified only on a single, non-mirrored instance (see the Cloud Migration Technical Finding) — so that SPOF cannot be removed by failover; it is instead mitigated to a short, bounded restore-time gap by automated backups, point-in-time recovery, frequent transaction-log backups and a cross-Region DR copy. Testing: terminate an application instance and confirm the ASG replaces it with no outage; remove an AZ's capacity and confirm the application stays available from the other AZ; and perform a point-in-time restore and a cross-Region DR restore, confirming recovery within the business-day RTO with no data loss. Accepting the residual database SPOF is a proportionate, cost-justified decision for a business-hours finance system — replacing Ledgerline to obtain database failover would be disproportionate.</w:t>
+        <w:t>The baseline's single points of failure are the single-AZ application tier and the single-instance database. The design removes the application-tier SPOF by spanning the network across two AZs and running the application Auto Scaling group across both AZs behind the internal load balancer. The database SPOF is removed the same way: the instance is converted to a Multi-AZ deployment with a synchronously replicated standby in the second AZ and automatic failover, which the application follows by endpoint name without reconfiguration. Backups, point-in-time recovery, frequent transaction-log backups and a cross-Region DR copy remain behind it, because failover does not protect against data loss, corruption or a Region-level event. Testing: terminate an application instance and confirm the ASG replaces it with no outage; remove an AZ's capacity and confirm the application stays available from the other AZ; force a database failover and confirm the standby is promoted and service resumes inside two minutes; and perform a point-in-time restore and a cross-Region DR restore, confirming recovery with no data loss.</w:t>
       </w:r>
     </w:p>
     <w:p>
@@ -4153,7 +4153,7 @@
         <w:rPr>
           <w:sz w:val="21"/>
         </w:rPr>
-        <w:t>Security — KMS encryption, Secrets Manager and least-privilege IAM roles remove plaintext secrets and tighten access. Reliability — a cross-AZ Auto Scaling group survives an AZ or instance failure automatically; the database cannot be Multi-AZ (Ledgerline constraint), so it is protected by automated backups, point-in-time recovery and a cross-Region DR copy. Scalability — ASG target-tracking and elastic gp3/S3 storage add capacity on demand without manual change or over-provisioning. Cost — a business-hours start/stop schedule on the idle-overnight compute and S3 lifecycle tiering on the growing document store cut spend without reducing service.</w:t>
+        <w:t>Security — KMS encryption, Secrets Manager and least-privilege IAM roles remove plaintext secrets and tighten access. Reliability — a cross-AZ Auto Scaling group survives an AZ or instance failure automatically, and a Multi-AZ database promotes its standby automatically, with backups, point-in-time recovery and a cross-Region DR copy behind it. Scalability — ASG target-tracking and elastic gp3/S3 storage add capacity on demand without manual change or over-provisioning. Cost — a business-hours start/stop schedule on the idle-overnight compute and S3 lifecycle tiering on the growing document store cut spend without reducing service.</w:t>
       </w:r>
     </w:p>
     <w:p>

</xml_diff>

<commit_message>
CL3 AT1 solution design: PostgreSQL, not SQL Server
Matches the cloud current-state records. Section 4.6 heading, the baseline
description, the preserved stack, and the database cost line - which loses the
License Included vs BYOL review, since the managed PostgreSQL engine carries no
proprietary licence.

Co-Authored-By: Claude Opus 5 (1M context) <noreply@anthropic.com>
</commit_message>
<xml_diff>
--- a/S1-CL3-Cloud-Infrastructure-Improvement/assessments/AT1/AT1-exemplar-solution-design.docx
+++ b/S1-CL3-Cloud-Infrastructure-Improvement/assessments/AT1/AT1-exemplar-solution-design.docx
@@ -534,7 +534,7 @@
         <w:rPr>
           <w:sz w:val="21"/>
         </w:rPr>
-        <w:t>This design is built from the Improvement Requirements (IR-1 to IR-7), the Indian Regulatory Requirements, the Accounting System Cloud Architecture Baseline Design, the Infrastructure Specifications, and the Operational Costing. Ledgerline is an internal, staff-only, business-hours workload (~60 users, ~15-25 concurrent, peaks of ~45-55 at month-end and EOFY, effectively idle overnight and at weekends), reached over the Site-to-Site VPN — not public-facing. The application runs on Windows Server with a Microsoft SQL Server database; financial records carry a 7-year retention obligation.</w:t>
+        <w:t>This design is built from the Improvement Requirements (IR-1 to IR-7), the Indian Regulatory Requirements, the Accounting System Cloud Architecture Baseline Design, the Infrastructure Specifications, and the Operational Costing. Ledgerline is an internal, staff-only, business-hours workload (~60 users, ~15-25 concurrent, peaks of ~45-55 at month-end and EOFY, effectively idle overnight and at weekends), reached over the Site-to-Site VPN — not public-facing. The application runs on Amazon Linux with an Amazon RDS for PostgreSQL database; financial records carry a 7-year retention obligation.</w:t>
       </w:r>
     </w:p>
     <w:p>
@@ -1072,7 +1072,7 @@
         <w:rPr>
           <w:sz w:val="21"/>
         </w:rPr>
-        <w:t>The baseline is a single-AZ deployment in ap-southeast-2 (Sydney): an EC2 application tier (Windows Server, Auto Scaling group min 1 / max 2) in one Availability Zone behind an internal Application Load Balancer; an Amazon RDS for SQL Server database (single-AZ); document attachments on Amazon S3; gp3 EBS volumes; reached over the Site-to-Site VPN. It is functional but was provisioned for the migration, with high-availability hardening explicitly deferred.</w:t>
+        <w:t>The baseline is a single-AZ deployment in ap-southeast-2 (Sydney): an EC2 application tier (Amazon Linux, Auto Scaling group min 1 / max 2) in one Availability Zone behind an internal Application Load Balancer; an Amazon RDS for PostgreSQL database (single-AZ); document attachments on Amazon S3; gp3 EBS volumes; reached over the Site-to-Site VPN. It is functional but was provisioned for the migration, with high-availability hardening explicitly deferred.</w:t>
       </w:r>
     </w:p>
     <w:p>
@@ -1933,7 +1933,7 @@
         <w:rPr>
           <w:sz w:val="21"/>
         </w:rPr>
-        <w:t>Reviewed against IR-1 to IR-7, the improvement is: make the application tier Multi-AZ on a two-AZ network and convert the database to a Multi-AZ deployment with an automatic-failover standby (with backup, point-in-time restore and cross-Region DR behind it), harden security, realise the idle-profile and storage cost savings, confirm elastic headroom, and add the light India residency slice for regulatory logs and financial records. The application, its SQL Server stack and its data are preserved (IR-4); every change is proportionate and cost-justified (IR-2, IR-6).</w:t>
+        <w:t>Reviewed against IR-1 to IR-7, the improvement is: make the application tier Multi-AZ on a two-AZ network and convert the database to a Multi-AZ deployment with an automatic-failover standby (with backup, point-in-time restore and cross-Region DR behind it), harden security, realise the idle-profile and storage cost savings, confirm elastic headroom, and add the light India residency slice for regulatory logs and financial records. The application, its PostgreSQL stack and its data are preserved (IR-4); every change is proportionate and cost-justified (IR-2, IR-6).</w:t>
       </w:r>
     </w:p>
     <w:p>
@@ -2545,7 +2545,7 @@
         <w:pStyle w:val="Heading3"/>
       </w:pPr>
       <w:r>
-        <w:t>4.6 Component 3 — Database (RDS for SQL Server)</w:t>
+        <w:t>4.6 Component 3 — Database (RDS for PostgreSQL)</w:t>
       </w:r>
     </w:p>
     <w:p>
@@ -2776,7 +2776,7 @@
               <w:rPr>
                 <w:sz w:val="18"/>
               </w:rPr>
-              <w:t>Right-sized to measured load; a Savings Plan / Reserved Instance for the steady baseline; SQL Server licensing model reviewed (License Included vs BYOL) and made explicit; backup retention tuned (long-term financial-records retention handled by export to S3, not live RDS)</w:t>
+              <w:t>Right-sized to measured load; a Savings Plan / Reserved Instance for the steady baseline; no proprietary database licence to optimise — the managed PostgreSQL engine is a per-hour platform cost, unlike the per-core licensing the on-premises deployment carried; backup retention tuned (long-term financial-records retention handled by export to S3, not live RDS)</w:t>
             </w:r>
           </w:p>
         </w:tc>

</xml_diff>